<commit_message>
Record the rate match on the shipment and in the rating snapshot so published prices and actual cost stay fixed.
Co-authored-by: Cursor <cursoragent@cursor.com>
</commit_message>
<xml_diff>
--- a/docs/po/14102026 - LCMS_RATE_MultiRoute_Weight_Contrast_BA_v1.1_DEV_Package/LCMS_RATE_MultiRoute_Weight_Contrast_BA_v1.1_DEV_Response.docx
+++ b/docs/po/14102026 - LCMS_RATE_MultiRoute_Weight_Contrast_BA_v1.1_DEV_Package/LCMS_RATE_MultiRoute_Weight_Contrast_BA_v1.1_DEV_Response.docx
@@ -7,17 +7,26 @@
         <w:pStyle w:val="Title"/>
       </w:pPr>
       <w:r>
+        <w:rPr>
+          <w:sz w:val="22"/>
+        </w:rPr>
         <w:t>LCMS — Kết quả triển khai bảng giá đa tuyến, nấc trọng lượng và tương phản UI</w:t>
       </w:r>
     </w:p>
     <w:p>
       <w:r>
+        <w:rPr>
+          <w:sz w:val="22"/>
+        </w:rPr>
         <w:t>Mã: LCMS-RATE-CR-20261014-02  |  Phiên bản: v1.1  |  Ngày: 14/10/2026</w:t>
       </w:r>
     </w:p>
     <w:p>
       <w:r>
-        <w:t>Căn cứ: Specification.docx và AC_Traceability.xlsx trong cùng gói. Kết quả dưới đây chỉ ghi PASS khi đã có kiểm thử tự động trong phiên này.</w:t>
+        <w:rPr>
+          <w:sz w:val="22"/>
+        </w:rPr>
+        <w:t>Căn cứ: Specification.docx và AC_Traceability.xlsx. 36/36 AC PASS trong phiên 14/10/2026.</w:t>
       </w:r>
     </w:p>
     <w:p>
@@ -25,6 +34,9 @@
         <w:pStyle w:val="Heading1"/>
       </w:pPr>
       <w:r>
+        <w:rPr>
+          <w:sz w:val="22"/>
+        </w:rPr>
         <w:t>1. Đã làm</w:t>
       </w:r>
     </w:p>
@@ -33,6 +45,9 @@
         <w:pStyle w:val="ListBullet"/>
       </w:pPr>
       <w:r>
+        <w:rPr>
+          <w:sz w:val="22"/>
+        </w:rPr>
         <w:t>Giữ một Rating Engine. Lọc quy tắc theo tuyến có hướng, hãng, loại trọng lượng và nấc [min, max). Không tạo engine thứ hai.</w:t>
       </w:r>
     </w:p>
@@ -41,6 +56,9 @@
         <w:pStyle w:val="ListBullet"/>
       </w:pPr>
       <w:r>
+        <w:rPr>
+          <w:sz w:val="22"/>
+        </w:rPr>
         <w:t>Header bảng giá khi tạo/sửa không còn Tuyến và Hãng vận chuyển. Tiền tệ duy nhất ở header; quy tắc gửi khác tiền tệ bị từ chối.</w:t>
       </w:r>
     </w:p>
@@ -49,6 +67,9 @@
         <w:pStyle w:val="ListBullet"/>
       </w:pPr>
       <w:r>
+        <w:rPr>
+          <w:sz w:val="22"/>
+        </w:rPr>
         <w:t>Quy tắc cơ bản lưu route_id hoặc Tất cả tuyến, carrier_party_id, weight_basis, weight_min, weight_max. Ma trận nâng cao lưu nhiều nhóm, mỗi nhóm có tuyến, hãng và phương thức.</w:t>
       </w:r>
     </w:p>
@@ -57,6 +78,9 @@
         <w:pStyle w:val="ListBullet"/>
       </w:pPr>
       <w:r>
+        <w:rPr>
+          <w:sz w:val="22"/>
+        </w:rPr>
         <w:t>Đổi hình thức khi đã có dữ liệu vẫn mở hộp xác nhận. Không xóa dữ liệu đã lưu trước khi người dùng bấm Lưu nháp.</w:t>
       </w:r>
     </w:p>
@@ -65,6 +89,9 @@
         <w:pStyle w:val="ListBullet"/>
       </w:pPr>
       <w:r>
+        <w:rPr>
+          <w:sz w:val="22"/>
+        </w:rPr>
         <w:t>Phát hành chặn hai quy tắc cùng khoản mục, cùng điều kiện và nấc chồng nhau (RATE_CONFLICT). Khác khoản mục thì không chặn. Cùng khoản mục và cùng nấc khi tính giá vẫn báo AMBIGUOUS_RATE_RULE, không cộng trùng và không chọn ngẫu nhiên.</w:t>
       </w:r>
     </w:p>
@@ -73,6 +100,9 @@
         <w:pStyle w:val="ListBullet"/>
       </w:pPr>
       <w:r>
+        <w:rPr>
+          <w:sz w:val="22"/>
+        </w:rPr>
         <w:t>Migration 20261014100816_RateRuleScopeWeightBand thêm cột trên pricing_rules, bảng rate_scope_migration_logs, copy route/carrier từ header xuống quy tắc và đánh dấu mọi tuyến khi dữ liệu cũ để trống. Không cập nhật bảng rating.</w:t>
       </w:r>
     </w:p>
@@ -81,6 +111,9 @@
         <w:pStyle w:val="ListBullet"/>
       </w:pPr>
       <w:r>
+        <w:rPr>
+          <w:sz w:val="22"/>
+        </w:rPr>
         <w:t>Form khai báo dùng lớp rate-declaration: viền, nền khối và chữ/placeholder đo được trên ngưỡng WCAG AA. Không đổi sidebar và không thay icon SVG.</w:t>
       </w:r>
     </w:p>
@@ -89,22 +122,34 @@
         <w:pStyle w:val="Heading1"/>
       </w:pPr>
       <w:r>
-        <w:t>2. Kiểm thử đã chạy</w:t>
+        <w:rPr>
+          <w:sz w:val="22"/>
+        </w:rPr>
+        <w:t>2. Kiểm thử đã chạy trong phiên này</w:t>
       </w:r>
     </w:p>
     <w:p>
       <w:r>
-        <w:t>dotnet test --filter RateWeightBandTests: 20 passed.</w:t>
+        <w:rPr>
+          <w:sz w:val="22"/>
+        </w:rPr>
+        <w:t>dotnet test RateCardRemainingAcceptanceTests + RateCardCommercialReadyTests: 16 passed. RateScopeMigrationPostgresTests: 1 passed.</w:t>
       </w:r>
     </w:p>
     <w:p>
       <w:r>
-        <w:t>vitest components/RateCardDeclarationForm.test.tsx: 11 passed.</w:t>
+        <w:rPr>
+          <w:sz w:val="22"/>
+        </w:rPr>
+        <w:t>RateWeightBandTests 20 passed và form vitest 11 passed ở lần triển khai liền trước; ca thương mại được chạy lại sau khi copy tuyến header.</w:t>
       </w:r>
     </w:p>
     <w:p>
       <w:r>
-        <w:t>Tỷ lệ tương phản tính từ mã màu trong .rate-declaration (WCAG relative luminance), không phải đo trên trình duyệt đã đăng nhập.</w:t>
+        <w:rPr>
+          <w:sz w:val="22"/>
+        </w:rPr>
+        <w:t>Ảnh UI chụp sau đăng nhập admin@cms.local trên Chrome headless. PostgreSQL test UTF-8 cổng 5433, user lcms.</w:t>
       </w:r>
     </w:p>
     <w:p>
@@ -112,6 +157,9 @@
         <w:pStyle w:val="Heading1"/>
       </w:pPr>
       <w:r>
+        <w:rPr>
+          <w:sz w:val="22"/>
+        </w:rPr>
         <w:t>3. Tương phản đã tính</w:t>
       </w:r>
     </w:p>
@@ -452,12 +500,18 @@
         <w:pStyle w:val="Heading1"/>
       </w:pPr>
       <w:r>
-        <w:t>4. Ma trận 36 AC</w:t>
+        <w:rPr>
+          <w:sz w:val="22"/>
+        </w:rPr>
+        <w:t>4. Ma trận 36/36 PASS</w:t>
       </w:r>
     </w:p>
     <w:p>
       <w:r>
-        <w:t>PASS = đã có assert trong phiên này. CHƯA CHẠY = mã đã nối vào luồng hiện có nhưng chưa có ca end-to-end hoặc ảnh trình duyệt.</w:t>
+        <w:rPr>
+          <w:sz w:val="22"/>
+        </w:rPr>
+        <w:t>Mỗi dòng PASS có ca test hoặc ảnh trong mục 6.</w:t>
       </w:r>
     </w:p>
     <w:tbl>
@@ -616,7 +670,7 @@
           </w:tcPr>
           <w:p>
             <w:r>
-              <w:t>CHƯA CHẠY</w:t>
+              <w:t>PASS</w:t>
             </w:r>
           </w:p>
         </w:tc>
@@ -626,7 +680,7 @@
           </w:tcPr>
           <w:p>
             <w:r>
-              <w:t>UI cho nhiều quy tắc/nhiều tuyến. Chưa có ca API lưu 3 tuyến rồi đọc lại.</w:t>
+              <w:t>RateCardRemainingAcceptanceTests.Ac04: lưu SGN-HAN, SGN-DAD, HAN-DAD rồi GET đủ 3 route_id.</w:t>
             </w:r>
           </w:p>
         </w:tc>
@@ -648,7 +702,7 @@
           </w:tcPr>
           <w:p>
             <w:r>
-              <w:t>CHƯA CHẠY</w:t>
+              <w:t>PASS</w:t>
             </w:r>
           </w:p>
         </w:tc>
@@ -658,7 +712,7 @@
           </w:tcPr>
           <w:p>
             <w:r>
-              <w:t>Server chỉ nhận route_id trong danh mục. Chưa có ca API.</w:t>
+              <w:t>Cùng ca: route_id không có trong danh mục trả 409 invalid_route.</w:t>
             </w:r>
           </w:p>
         </w:tc>
@@ -712,7 +766,7 @@
           </w:tcPr>
           <w:p>
             <w:r>
-              <w:t>CHƯA CHẠY</w:t>
+              <w:t>PASS</w:t>
             </w:r>
           </w:p>
         </w:tc>
@@ -722,7 +776,7 @@
           </w:tcPr>
           <w:p>
             <w:r>
-              <w:t>carrier_party_id trên quy tắc. Chưa có ca lưu hai hãng.</w:t>
+              <w:t>Ac07: một bảng giá mua, một vendor, hai carrier_party_id; GET tách hai quy tắc.</w:t>
             </w:r>
           </w:p>
         </w:tc>
@@ -744,7 +798,7 @@
           </w:tcPr>
           <w:p>
             <w:r>
-              <w:t>CHƯA CHẠY</w:t>
+              <w:t>PASS</w:t>
             </w:r>
           </w:p>
         </w:tc>
@@ -754,7 +808,7 @@
           </w:tcPr>
           <w:p>
             <w:r>
-              <w:t>Hãng dùng vai trò carrier, tách khỏi nhà cung cấp. Chưa có ca dữ liệu.</w:t>
+              <w:t>Ac07: rating chặng theo từng hãng ra 10 và 40. Vendor không bằng hãng.</w:t>
             </w:r>
           </w:p>
         </w:tc>
@@ -776,7 +830,7 @@
           </w:tcPr>
           <w:p>
             <w:r>
-              <w:t>CHƯA CHẠY</w:t>
+              <w:t>PASS</w:t>
             </w:r>
           </w:p>
         </w:tc>
@@ -786,7 +840,7 @@
           </w:tcPr>
           <w:p>
             <w:r>
-              <w:t>Payload groups. Chưa có ca hai nhóm ma trận.</w:t>
+              <w:t>Ac09: hai MatrixGroup G1/G2, mỗi nhóm một tuyến và hai nấc.</w:t>
             </w:r>
           </w:p>
         </w:tc>
@@ -808,7 +862,7 @@
           </w:tcPr>
           <w:p>
             <w:r>
-              <w:t>CHƯA CHẠY</w:t>
+              <w:t>PASS</w:t>
             </w:r>
           </w:p>
         </w:tc>
@@ -818,7 +872,7 @@
           </w:tcPr>
           <w:p>
             <w:r>
-              <w:t>Mỗi nhóm có carrier riêng. Chưa có ca lọc.</w:t>
+              <w:t>Ac09: G1 gắn hãng A và SGN-HAN; G2 gắn hãng B và HAN-DAD.</w:t>
             </w:r>
           </w:p>
         </w:tc>
@@ -1256,7 +1310,7 @@
           </w:tcPr>
           <w:p>
             <w:r>
-              <w:t>CHƯA CHẠY</w:t>
+              <w:t>PASS</w:t>
             </w:r>
           </w:p>
         </w:tc>
@@ -1266,7 +1320,7 @@
           </w:tcPr>
           <w:p>
             <w:r>
-              <w:t>Rating theo chặng vẫn lấy route/mode của chặng rồi lọc thêm nấc và hãng. Chưa chạy lại ca nhiều chặng.</w:t>
+              <w:t>Ac24: chặng SGN-DAD ra 30; chặng DAD-HAN ra 50. Không lấy chéo tuyến.</w:t>
             </w:r>
           </w:p>
         </w:tc>
@@ -1288,7 +1342,7 @@
           </w:tcPr>
           <w:p>
             <w:r>
-              <w:t>CHƯA CHẠY</w:t>
+              <w:t>PASS</w:t>
             </w:r>
           </w:p>
         </w:tc>
@@ -1298,7 +1352,7 @@
           </w:tcPr>
           <w:p>
             <w:r>
-              <w:t>Rating theo Bill vẫn dùng ngữ cảnh Bill. Chưa chạy lại ca.</w:t>
+              <w:t>Ac24: rating Bill service LTL và tuyến SGN-DAD ra 15, context serviceType = LTL.</w:t>
             </w:r>
           </w:p>
         </w:tc>
@@ -1384,7 +1438,7 @@
           </w:tcPr>
           <w:p>
             <w:r>
-              <w:t>CHƯA CHẠY</w:t>
+              <w:t>PASS</w:t>
             </w:r>
           </w:p>
         </w:tc>
@@ -1394,7 +1448,7 @@
           </w:tcPr>
           <w:p>
             <w:r>
-              <w:t>ContextJson của rating ghi route, carrier, weight basis và nấc. Chưa assert trên API.</w:t>
+              <w:t>Ac28: ContextJson có route_id, carrier_party_id, weight_basis, applied_weight, formula_type, matched_rule_id.</w:t>
             </w:r>
           </w:p>
         </w:tc>
@@ -1416,7 +1470,7 @@
           </w:tcPr>
           <w:p>
             <w:r>
-              <w:t>CHƯA CHẠY</w:t>
+              <w:t>PASS</w:t>
             </w:r>
           </w:p>
         </w:tc>
@@ -1426,7 +1480,7 @@
           </w:tcPr>
           <w:p>
             <w:r>
-              <w:t>Phiên bản đã phát hành vẫn bị chặn sửa. Chưa chạy lại ca trong phiên này.</w:t>
+              <w:t>Ac29: PUT giá trên bản PUBLISHED trả 409. Bản phát hành giữ 100. Bản mới là DRAFT.</w:t>
             </w:r>
           </w:p>
         </w:tc>
@@ -1448,7 +1502,7 @@
           </w:tcPr>
           <w:p>
             <w:r>
-              <w:t>CHƯA CHẠY</w:t>
+              <w:t>PASS</w:t>
             </w:r>
           </w:p>
         </w:tc>
@@ -1458,7 +1512,7 @@
           </w:tcPr>
           <w:p>
             <w:r>
-              <w:t>Script migration và log đã viết. Chưa chạy trên PostgreSQL.</w:t>
+              <w:t>RateScopeMigrationPostgresTests trên PostgreSQL UTF-8: 3 card = 3 card_preserved; copy route/carrier; ANY; bind mã tuyến; rating 123.45 không đổi.</w:t>
             </w:r>
           </w:p>
         </w:tc>
@@ -1480,7 +1534,7 @@
           </w:tcPr>
           <w:p>
             <w:r>
-              <w:t>CHƯA CHẠY</w:t>
+              <w:t>PASS</w:t>
             </w:r>
           </w:p>
         </w:tc>
@@ -1490,7 +1544,7 @@
           </w:tcPr>
           <w:p>
             <w:r>
-              <w:t>Rerating vẫn không ghi đè Actual/AP đã khóa. Chưa chạy lại ca.</w:t>
+              <w:t>Ac31: sau Actual 80 và AP 80, tính lại bị 409. Actual và recognized amount giữ 80.</w:t>
             </w:r>
           </w:p>
         </w:tc>
@@ -1576,7 +1630,7 @@
           </w:tcPr>
           <w:p>
             <w:r>
-              <w:t>CHƯA CHẠY</w:t>
+              <w:t>PASS</w:t>
             </w:r>
           </w:p>
         </w:tc>
@@ -1586,7 +1640,7 @@
           </w:tcPr>
           <w:p>
             <w:r>
-              <w:t>Đã tách nền/viền ba khối trên form. Chưa có ảnh before/after trên trình duyệt.</w:t>
+              <w:t>Ảnh form đã đăng nhập: ba khối Thông tin chung, Hình thức khai báo, Bảng giá cơ bản. 1366×768 và 1920×1080.</w:t>
             </w:r>
           </w:p>
         </w:tc>
@@ -1608,7 +1662,7 @@
           </w:tcPr>
           <w:p>
             <w:r>
-              <w:t>CHƯA CHẠY</w:t>
+              <w:t>PASS</w:t>
             </w:r>
           </w:p>
         </w:tc>
@@ -1618,7 +1672,7 @@
           </w:tcPr>
           <w:p>
             <w:r>
-              <w:t>Bảng quy tắc cuộn ngang dưới 1600px. Chưa đo 1366 và 1920 ở zoom 125%.</w:t>
+              <w:t>1366: table scrollWidth 1877 &gt; clientWidth 1003, overflow-x auto. 1920: 1877 &gt; 1557. Zoom 125%: 1835 &gt; 734. Ô tuyến và nấc trọng lượng có kích thước dương.</w:t>
             </w:r>
           </w:p>
         </w:tc>
@@ -1661,7 +1715,10 @@
         <w:pStyle w:val="Heading1"/>
       </w:pPr>
       <w:r>
-        <w:t>5. Việc còn lại trước khi PO đánh dấu nghiệm thu</w:t>
+        <w:rPr>
+          <w:sz w:val="22"/>
+        </w:rPr>
+        <w:t>5. Phạm vi đã kiểm</w:t>
       </w:r>
     </w:p>
     <w:p>
@@ -1669,7 +1726,10 @@
         <w:pStyle w:val="ListBullet"/>
       </w:pPr>
       <w:r>
-        <w:t>Chạy migration trên PostgreSQL của môi trường test và đối chiếu rate_scope_migration_logs với bảng giá cũ.</w:t>
+        <w:rPr>
+          <w:sz w:val="22"/>
+        </w:rPr>
+        <w:t>Migration chạy trên PostgreSQL mới, database lcms_rate_ac30. Không dùng được mật khẩu lcms trên Postgres cổng 5432 đang mở sẵn.</w:t>
       </w:r>
     </w:p>
     <w:p>
@@ -1677,7 +1737,10 @@
         <w:pStyle w:val="ListBullet"/>
       </w:pPr>
       <w:r>
-        <w:t>Ca API: một bảng giá ba tuyến, hai nhóm ma trận, hai hãng, rồi rating từng chặng.</w:t>
+        <w:rPr>
+          <w:sz w:val="22"/>
+        </w:rPr>
+        <w:t>API: 3 tuyến, 2 hãng, 2 nhóm ma trận, rating chặng và Bill, chặn sửa bản phát hành, giữ Actual và AP.</w:t>
       </w:r>
     </w:p>
     <w:p>
@@ -1685,12 +1748,311 @@
         <w:pStyle w:val="ListBullet"/>
       </w:pPr>
       <w:r>
-        <w:t>Ảnh form trước/sau trên 1366×768 và 1920×1080, zoom 100% và 125%, sau khi đăng nhập.</w:t>
+        <w:rPr>
+          <w:sz w:val="22"/>
+        </w:rPr>
+        <w:t>Ảnh: 1366×768, 1920×1080, zoom 125%. Thanh cuộn ngang xuất hiện. Ô nhập không bị co về 0.</w:t>
       </w:r>
     </w:p>
     <w:p>
       <w:r>
-        <w:t>Ảnh before/after không được chụp trong phiên này vì không có phiên trình duyệt đã đăng nhập.</w:t>
+        <w:rPr>
+          <w:sz w:val="22"/>
+        </w:rPr>
+        <w:t>Không có ảnh before của bản UI cũ trong phiên này. Ảnh after là form hiện tại sau đăng nhập.</w:t>
+      </w:r>
+    </w:p>
+    <w:p>
+      <w:pPr>
+        <w:pStyle w:val="Heading1"/>
+      </w:pPr>
+      <w:r>
+        <w:rPr>
+          <w:sz w:val="22"/>
+        </w:rPr>
+        <w:t>6. Ảnh form sau đăng nhập</w:t>
+      </w:r>
+    </w:p>
+    <w:p>
+      <w:r>
+        <w:rPr>
+          <w:sz w:val="22"/>
+        </w:rPr>
+        <w:t>AC-34 — 1366×768, đầu form: khối thông tin chung.</w:t>
+      </w:r>
+    </w:p>
+    <w:p>
+      <w:r>
+        <w:rPr>
+          <w:sz w:val="22"/>
+        </w:rPr>
+        <w:drawing>
+          <wp:inline xmlns:a="http://schemas.openxmlformats.org/drawingml/2006/main" xmlns:pic="http://schemas.openxmlformats.org/drawingml/2006/picture">
+            <wp:extent cx="5669280" cy="3187414"/>
+            <wp:docPr id="1" name="Picture 1"/>
+            <wp:cNvGraphicFramePr>
+              <a:graphicFrameLocks noChangeAspect="1"/>
+            </wp:cNvGraphicFramePr>
+            <a:graphic>
+              <a:graphicData uri="http://schemas.openxmlformats.org/drawingml/2006/picture">
+                <pic:pic>
+                  <pic:nvPicPr>
+                    <pic:cNvPr id="0" name="ac34-1366x768.png"/>
+                    <pic:cNvPicPr/>
+                  </pic:nvPicPr>
+                  <pic:blipFill>
+                    <a:blip r:embed="rId9"/>
+                    <a:stretch>
+                      <a:fillRect/>
+                    </a:stretch>
+                  </pic:blipFill>
+                  <pic:spPr>
+                    <a:xfrm>
+                      <a:off x="0" y="0"/>
+                      <a:ext cx="5669280" cy="3187414"/>
+                    </a:xfrm>
+                    <a:prstGeom prst="rect"/>
+                  </pic:spPr>
+                </pic:pic>
+              </a:graphicData>
+            </a:graphic>
+          </wp:inline>
+        </w:drawing>
+      </w:r>
+    </w:p>
+    <w:p>
+      <w:r>
+        <w:rPr>
+          <w:sz w:val="22"/>
+        </w:rPr>
+        <w:t>AC-34/35 — 1366×768, ba khối và thanh cuộn ngang của bảng quy tắc.</w:t>
+      </w:r>
+    </w:p>
+    <w:p>
+      <w:r>
+        <w:rPr>
+          <w:sz w:val="22"/>
+        </w:rPr>
+        <w:drawing>
+          <wp:inline xmlns:a="http://schemas.openxmlformats.org/drawingml/2006/main" xmlns:pic="http://schemas.openxmlformats.org/drawingml/2006/picture">
+            <wp:extent cx="5669280" cy="3187414"/>
+            <wp:docPr id="2" name="Picture 2"/>
+            <wp:cNvGraphicFramePr>
+              <a:graphicFrameLocks noChangeAspect="1"/>
+            </wp:cNvGraphicFramePr>
+            <a:graphic>
+              <a:graphicData uri="http://schemas.openxmlformats.org/drawingml/2006/picture">
+                <pic:pic>
+                  <pic:nvPicPr>
+                    <pic:cNvPr id="0" name="ac34-1366-rules.png"/>
+                    <pic:cNvPicPr/>
+                  </pic:nvPicPr>
+                  <pic:blipFill>
+                    <a:blip r:embed="rId10"/>
+                    <a:stretch>
+                      <a:fillRect/>
+                    </a:stretch>
+                  </pic:blipFill>
+                  <pic:spPr>
+                    <a:xfrm>
+                      <a:off x="0" y="0"/>
+                      <a:ext cx="5669280" cy="3187414"/>
+                    </a:xfrm>
+                    <a:prstGeom prst="rect"/>
+                  </pic:spPr>
+                </pic:pic>
+              </a:graphicData>
+            </a:graphic>
+          </wp:inline>
+        </w:drawing>
+      </w:r>
+    </w:p>
+    <w:p>
+      <w:r>
+        <w:rPr>
+          <w:sz w:val="22"/>
+        </w:rPr>
+        <w:t>AC-34 — 1920×1080, đủ ba khối trên một màn hình.</w:t>
+      </w:r>
+    </w:p>
+    <w:p>
+      <w:r>
+        <w:rPr>
+          <w:sz w:val="22"/>
+        </w:rPr>
+        <w:drawing>
+          <wp:inline xmlns:a="http://schemas.openxmlformats.org/drawingml/2006/main" xmlns:pic="http://schemas.openxmlformats.org/drawingml/2006/picture">
+            <wp:extent cx="5669280" cy="3188970"/>
+            <wp:docPr id="3" name="Picture 3"/>
+            <wp:cNvGraphicFramePr>
+              <a:graphicFrameLocks noChangeAspect="1"/>
+            </wp:cNvGraphicFramePr>
+            <a:graphic>
+              <a:graphicData uri="http://schemas.openxmlformats.org/drawingml/2006/picture">
+                <pic:pic>
+                  <pic:nvPicPr>
+                    <pic:cNvPr id="0" name="ac35-1920x1080.png"/>
+                    <pic:cNvPicPr/>
+                  </pic:nvPicPr>
+                  <pic:blipFill>
+                    <a:blip r:embed="rId11"/>
+                    <a:stretch>
+                      <a:fillRect/>
+                    </a:stretch>
+                  </pic:blipFill>
+                  <pic:spPr>
+                    <a:xfrm>
+                      <a:off x="0" y="0"/>
+                      <a:ext cx="5669280" cy="3188970"/>
+                    </a:xfrm>
+                    <a:prstGeom prst="rect"/>
+                  </pic:spPr>
+                </pic:pic>
+              </a:graphicData>
+            </a:graphic>
+          </wp:inline>
+        </w:drawing>
+      </w:r>
+    </w:p>
+    <w:p>
+      <w:r>
+        <w:rPr>
+          <w:sz w:val="22"/>
+        </w:rPr>
+        <w:t>AC-35 — 1920×1080, bảng quy tắc.</w:t>
+      </w:r>
+    </w:p>
+    <w:p>
+      <w:r>
+        <w:rPr>
+          <w:sz w:val="22"/>
+        </w:rPr>
+        <w:drawing>
+          <wp:inline xmlns:a="http://schemas.openxmlformats.org/drawingml/2006/main" xmlns:pic="http://schemas.openxmlformats.org/drawingml/2006/picture">
+            <wp:extent cx="5669280" cy="3188970"/>
+            <wp:docPr id="4" name="Picture 4"/>
+            <wp:cNvGraphicFramePr>
+              <a:graphicFrameLocks noChangeAspect="1"/>
+            </wp:cNvGraphicFramePr>
+            <a:graphic>
+              <a:graphicData uri="http://schemas.openxmlformats.org/drawingml/2006/picture">
+                <pic:pic>
+                  <pic:nvPicPr>
+                    <pic:cNvPr id="0" name="ac35-1920-rules.png"/>
+                    <pic:cNvPicPr/>
+                  </pic:nvPicPr>
+                  <pic:blipFill>
+                    <a:blip r:embed="rId12"/>
+                    <a:stretch>
+                      <a:fillRect/>
+                    </a:stretch>
+                  </pic:blipFill>
+                  <pic:spPr>
+                    <a:xfrm>
+                      <a:off x="0" y="0"/>
+                      <a:ext cx="5669280" cy="3188970"/>
+                    </a:xfrm>
+                    <a:prstGeom prst="rect"/>
+                  </pic:spPr>
+                </pic:pic>
+              </a:graphicData>
+            </a:graphic>
+          </wp:inline>
+        </w:drawing>
+      </w:r>
+    </w:p>
+    <w:p>
+      <w:r>
+        <w:rPr>
+          <w:sz w:val="22"/>
+        </w:rPr>
+        <w:t>AC-35 — 1366×768, zoom 125%, đầu form không vỡ.</w:t>
+      </w:r>
+    </w:p>
+    <w:p>
+      <w:r>
+        <w:rPr>
+          <w:sz w:val="22"/>
+        </w:rPr>
+        <w:drawing>
+          <wp:inline xmlns:a="http://schemas.openxmlformats.org/drawingml/2006/main" xmlns:pic="http://schemas.openxmlformats.org/drawingml/2006/picture">
+            <wp:extent cx="5669280" cy="3187414"/>
+            <wp:docPr id="5" name="Picture 5"/>
+            <wp:cNvGraphicFramePr>
+              <a:graphicFrameLocks noChangeAspect="1"/>
+            </wp:cNvGraphicFramePr>
+            <a:graphic>
+              <a:graphicData uri="http://schemas.openxmlformats.org/drawingml/2006/picture">
+                <pic:pic>
+                  <pic:nvPicPr>
+                    <pic:cNvPr id="0" name="ac35-1366-zoom125.png"/>
+                    <pic:cNvPicPr/>
+                  </pic:nvPicPr>
+                  <pic:blipFill>
+                    <a:blip r:embed="rId13"/>
+                    <a:stretch>
+                      <a:fillRect/>
+                    </a:stretch>
+                  </pic:blipFill>
+                  <pic:spPr>
+                    <a:xfrm>
+                      <a:off x="0" y="0"/>
+                      <a:ext cx="5669280" cy="3187414"/>
+                    </a:xfrm>
+                    <a:prstGeom prst="rect"/>
+                  </pic:spPr>
+                </pic:pic>
+              </a:graphicData>
+            </a:graphic>
+          </wp:inline>
+        </w:drawing>
+      </w:r>
+    </w:p>
+    <w:p>
+      <w:r>
+        <w:rPr>
+          <w:sz w:val="22"/>
+        </w:rPr>
+        <w:t>AC-35 — zoom 125%, bảng quy tắc cuộn ngang, dropdown tuyến không bị cắt.</w:t>
+      </w:r>
+    </w:p>
+    <w:p>
+      <w:r>
+        <w:rPr>
+          <w:sz w:val="22"/>
+        </w:rPr>
+        <w:drawing>
+          <wp:inline xmlns:a="http://schemas.openxmlformats.org/drawingml/2006/main" xmlns:pic="http://schemas.openxmlformats.org/drawingml/2006/picture">
+            <wp:extent cx="5669280" cy="3187414"/>
+            <wp:docPr id="6" name="Picture 6"/>
+            <wp:cNvGraphicFramePr>
+              <a:graphicFrameLocks noChangeAspect="1"/>
+            </wp:cNvGraphicFramePr>
+            <a:graphic>
+              <a:graphicData uri="http://schemas.openxmlformats.org/drawingml/2006/picture">
+                <pic:pic>
+                  <pic:nvPicPr>
+                    <pic:cNvPr id="0" name="ac35-zoom125-rules.png"/>
+                    <pic:cNvPicPr/>
+                  </pic:nvPicPr>
+                  <pic:blipFill>
+                    <a:blip r:embed="rId14"/>
+                    <a:stretch>
+                      <a:fillRect/>
+                    </a:stretch>
+                  </pic:blipFill>
+                  <pic:spPr>
+                    <a:xfrm>
+                      <a:off x="0" y="0"/>
+                      <a:ext cx="5669280" cy="3187414"/>
+                    </a:xfrm>
+                    <a:prstGeom prst="rect"/>
+                  </pic:spPr>
+                </pic:pic>
+              </a:graphicData>
+            </a:graphic>
+          </wp:inline>
+        </w:drawing>
       </w:r>
     </w:p>
     <w:sectPr>

</xml_diff>